<commit_message>
fix: prevent doubled seniority prefixes and harden career-span split
</commit_message>
<xml_diff>
--- a/resumes/andre_williams.docx
+++ b/resumes/andre_williams.docx
@@ -12,7 +12,7 @@
     </w:p>
     <w:p>
       <w:r>
-        <w:t>Senior iOS Developer</w:t>
+        <w:t>Senior Mobile Engineer</w:t>
       </w:r>
     </w:p>
     <w:p>
@@ -25,12 +25,12 @@
         <w:pStyle w:val="Heading1"/>
       </w:pPr>
       <w:r>
-        <w:t>Professional Summary</w:t>
+        <w:t>PROFILE</w:t>
       </w:r>
     </w:p>
     <w:p>
       <w:r>
-        <w:t>Senior iOS Developer with 9+ years of experience specialising in Kotlin, Android, REST APIs. Track record of delivering reliable, measurable results in production systems.</w:t>
+        <w:t>Senior Mobile Engineer with 9+ years of experience specialising in Kotlin, Android, REST APIs. Track record of delivering reliable, measurable results in production systems.</w:t>
       </w:r>
     </w:p>
     <w:p>
@@ -38,7 +38,38 @@
         <w:pStyle w:val="Heading1"/>
       </w:pPr>
       <w:r>
-        <w:t>Technical Skills</w:t>
+        <w:t>CORE COMPETENCIES</w:t>
+      </w:r>
+    </w:p>
+    <w:p>
+      <w:r>
+        <w:t>Kotlin, Android, REST APIs, Git, React Native, iOS</w:t>
+      </w:r>
+    </w:p>
+    <w:p>
+      <w:pPr>
+        <w:pStyle w:val="Heading1"/>
+      </w:pPr>
+      <w:r>
+        <w:t>EDUCATION &amp; TRAINING</w:t>
+      </w:r>
+    </w:p>
+    <w:p>
+      <w:r>
+        <w:t>Master of Science in Computer Science, Northfield College (2016)</w:t>
+      </w:r>
+    </w:p>
+    <w:p>
+      <w:pPr>
+        <w:pStyle w:val="Heading1"/>
+      </w:pPr>
+      <w:r>
+        <w:t>EMPLOYMENT HISTORY</w:t>
+      </w:r>
+    </w:p>
+    <w:p>
+      <w:r>
+        <w:t>Senior iOS Developer, DataWorks (2023 - Present)</w:t>
       </w:r>
     </w:p>
     <w:p>
@@ -46,7 +77,7 @@
         <w:pStyle w:val="ListBullet"/>
       </w:pPr>
       <w:r>
-        <w:t>Kotlin</w:t>
+        <w:t>Cut app startup time 25% by profiling REST APIs initialisation.</w:t>
       </w:r>
     </w:p>
     <w:p>
@@ -54,7 +85,12 @@
         <w:pStyle w:val="ListBullet"/>
       </w:pPr>
       <w:r>
-        <w:t>Android</w:t>
+        <w:t>Built offline-first sync with REST APIs and iOS.</w:t>
+      </w:r>
+    </w:p>
+    <w:p>
+      <w:r>
+        <w:t>Mobile Engineer, Loop (2020 - 2023)</w:t>
       </w:r>
     </w:p>
     <w:p>
@@ -62,7 +98,7 @@
         <w:pStyle w:val="ListBullet"/>
       </w:pPr>
       <w:r>
-        <w:t>REST APIs</w:t>
+        <w:t>Led migration from REST APIs to Git, reducing crash rate 40%.</w:t>
       </w:r>
     </w:p>
     <w:p>
@@ -70,70 +106,12 @@
         <w:pStyle w:val="ListBullet"/>
       </w:pPr>
       <w:r>
-        <w:t>Git</w:t>
-      </w:r>
-    </w:p>
-    <w:p>
-      <w:pPr>
-        <w:pStyle w:val="ListBullet"/>
-      </w:pPr>
-      <w:r>
-        <w:t>Swift</w:t>
-      </w:r>
-    </w:p>
-    <w:p>
-      <w:pPr>
-        <w:pStyle w:val="ListBullet"/>
-      </w:pPr>
-      <w:r>
-        <w:t>Flutter</w:t>
-      </w:r>
-    </w:p>
-    <w:p>
-      <w:pPr>
-        <w:pStyle w:val="Heading1"/>
-      </w:pPr>
-      <w:r>
-        <w:t>Education</w:t>
+        <w:t>Built offline-first sync with Kotlin and Git.</w:t>
       </w:r>
     </w:p>
     <w:p>
       <w:r>
-        <w:t>M.Tech in Computer Science, Riverside University (2016)</w:t>
-      </w:r>
-    </w:p>
-    <w:p>
-      <w:pPr>
-        <w:pStyle w:val="Heading1"/>
-      </w:pPr>
-      <w:r>
-        <w:t>Work Experience</w:t>
-      </w:r>
-    </w:p>
-    <w:p>
-      <w:r>
-        <w:t>Senior Mobile Engineer, Craft Studio (2022 - Present)</w:t>
-      </w:r>
-    </w:p>
-    <w:p>
-      <w:pPr>
-        <w:pStyle w:val="ListBullet"/>
-      </w:pPr>
-      <w:r>
-        <w:t>Built offline-first sync with REST APIs and Android.</w:t>
-      </w:r>
-    </w:p>
-    <w:p>
-      <w:pPr>
-        <w:pStyle w:val="ListBullet"/>
-      </w:pPr>
-      <w:r>
-        <w:t>Led migration from Android to Flutter, reducing crash rate 25%.</w:t>
-      </w:r>
-    </w:p>
-    <w:p>
-      <w:r>
-        <w:t>Android Developer, Vertex Logistics (2021 - 2022)</w:t>
+        <w:t>iOS Developer, RetailX (2017 - 2020)</w:t>
       </w:r>
     </w:p>
     <w:p>
@@ -149,28 +127,7 @@
         <w:pStyle w:val="ListBullet"/>
       </w:pPr>
       <w:r>
-        <w:t>Led migration from Kotlin to Android, reducing crash rate 30%.</w:t>
-      </w:r>
-    </w:p>
-    <w:p>
-      <w:r>
-        <w:t>Mobile Engineer, HostPro (2017 - 2021)</w:t>
-      </w:r>
-    </w:p>
-    <w:p>
-      <w:pPr>
-        <w:pStyle w:val="ListBullet"/>
-      </w:pPr>
-      <w:r>
-        <w:t>Shipped REST APIs apps with 900k+ installs and 4.7-star ratings.</w:t>
-      </w:r>
-    </w:p>
-    <w:p>
-      <w:pPr>
-        <w:pStyle w:val="ListBullet"/>
-      </w:pPr>
-      <w:r>
-        <w:t>Built offline-first sync with Git and Flutter.</w:t>
+        <w:t>Cut app startup time 50% by profiling iOS initialisation.</w:t>
       </w:r>
     </w:p>
     <w:p>
@@ -178,12 +135,12 @@
         <w:pStyle w:val="Heading1"/>
       </w:pPr>
       <w:r>
-        <w:t>Projects</w:t>
+        <w:t>KEY PROJECTS</w:t>
       </w:r>
     </w:p>
     <w:p>
       <w:r>
-        <w:t>Fitness Tracker: REST APIs app with Android cloud sync.</w:t>
+        <w:t>Fitness Tracker: iOS app with Git cloud sync.</w:t>
       </w:r>
     </w:p>
     <w:sectPr>

</xml_diff>